<commit_message>
Prestação de contas: ajustes de layout e README
- linhas de seção das tabelas de verificação com altura normal
- rótulos encurtados para não quebrar linha (parcerias públicas, saldo conciliado)
- campo de saldo bancário com data e R$
- README descreve a pasta prestacao-de-contas e o módulo timbrado.py

Co-Authored-By: Claude Fable 5.1 <noreply@anthropic.com>
</commit_message>
<xml_diff>
--- a/prestacao-de-contas/Declaracao_de_Conformidade.docx
+++ b/prestacao-de-contas/Declaracao_de_Conformidade.docx
@@ -219,21 +219,33 @@
             <w:tcW w:type="dxa" w:w="822"/>
             <w:shd w:val="clear" w:color="auto" w:fill="E8EFE8"/>
           </w:tcPr>
-          <w:p/>
+          <w:p>
+            <w:pPr>
+              <w:spacing w:before="0" w:after="0" w:line="240" w:lineRule="auto"/>
+            </w:pPr>
+          </w:p>
         </w:tc>
         <w:tc>
           <w:tcPr>
             <w:tcW w:type="dxa" w:w="822"/>
             <w:shd w:val="clear" w:color="auto" w:fill="E8EFE8"/>
           </w:tcPr>
-          <w:p/>
+          <w:p>
+            <w:pPr>
+              <w:spacing w:before="0" w:after="0" w:line="240" w:lineRule="auto"/>
+            </w:pPr>
+          </w:p>
         </w:tc>
         <w:tc>
           <w:tcPr>
             <w:tcW w:type="dxa" w:w="850"/>
             <w:shd w:val="clear" w:color="auto" w:fill="E8EFE8"/>
           </w:tcPr>
-          <w:p/>
+          <w:p>
+            <w:pPr>
+              <w:spacing w:before="0" w:after="0" w:line="240" w:lineRule="auto"/>
+            </w:pPr>
+          </w:p>
         </w:tc>
       </w:tr>
       <w:tr>
@@ -587,21 +599,33 @@
             <w:tcW w:type="dxa" w:w="822"/>
             <w:shd w:val="clear" w:color="auto" w:fill="E8EFE8"/>
           </w:tcPr>
-          <w:p/>
+          <w:p>
+            <w:pPr>
+              <w:spacing w:before="0" w:after="0" w:line="240" w:lineRule="auto"/>
+            </w:pPr>
+          </w:p>
         </w:tc>
         <w:tc>
           <w:tcPr>
             <w:tcW w:type="dxa" w:w="822"/>
             <w:shd w:val="clear" w:color="auto" w:fill="E8EFE8"/>
           </w:tcPr>
-          <w:p/>
+          <w:p>
+            <w:pPr>
+              <w:spacing w:before="0" w:after="0" w:line="240" w:lineRule="auto"/>
+            </w:pPr>
+          </w:p>
         </w:tc>
         <w:tc>
           <w:tcPr>
             <w:tcW w:type="dxa" w:w="850"/>
             <w:shd w:val="clear" w:color="auto" w:fill="E8EFE8"/>
           </w:tcPr>
-          <w:p/>
+          <w:p>
+            <w:pPr>
+              <w:spacing w:before="0" w:after="0" w:line="240" w:lineRule="auto"/>
+            </w:pPr>
+          </w:p>
         </w:tc>
       </w:tr>
       <w:tr>
@@ -1036,21 +1060,33 @@
             <w:tcW w:type="dxa" w:w="822"/>
             <w:shd w:val="clear" w:color="auto" w:fill="E8EFE8"/>
           </w:tcPr>
-          <w:p/>
+          <w:p>
+            <w:pPr>
+              <w:spacing w:before="0" w:after="0" w:line="240" w:lineRule="auto"/>
+            </w:pPr>
+          </w:p>
         </w:tc>
         <w:tc>
           <w:tcPr>
             <w:tcW w:type="dxa" w:w="822"/>
             <w:shd w:val="clear" w:color="auto" w:fill="E8EFE8"/>
           </w:tcPr>
-          <w:p/>
+          <w:p>
+            <w:pPr>
+              <w:spacing w:before="0" w:after="0" w:line="240" w:lineRule="auto"/>
+            </w:pPr>
+          </w:p>
         </w:tc>
         <w:tc>
           <w:tcPr>
             <w:tcW w:type="dxa" w:w="850"/>
             <w:shd w:val="clear" w:color="auto" w:fill="E8EFE8"/>
           </w:tcPr>
-          <w:p/>
+          <w:p>
+            <w:pPr>
+              <w:spacing w:before="0" w:after="0" w:line="240" w:lineRule="auto"/>
+            </w:pPr>
+          </w:p>
         </w:tc>
       </w:tr>
       <w:tr>

</xml_diff>